<commit_message>
Register the Day 3 Session 3 exercises in the partner brief
The exercise plan carried a placeholder for Oct 14 Session 3 saying the exercises would be added once the session was drafted. It now is, so the placeholder is replaced with the four exercises: the opening and closing sign-off vote, the strong-versus-weak question sort, the clinic itself, and the AI question list comparison. It also records the QA checklist handout as a built artefact ready to print, since the partner needs to know it exists and where it comes from.

Written with officer, which round-trips the whole document. Verified after writing that the structure is unchanged: 12 tables, 63 rows, 422 paragraphs, and the same 13 package parts including styles, numbering and comments. Only the placeholder text differs. The previous version is in git if anything looks off in Word.
</commit_message>
<xml_diff>
--- a/Module_2_Oct_2026_v2/Module2_exercise_plan.docx
+++ b/Module_2_Oct_2026_v2/Module2_exercise_plan.docx
@@ -1238,7 +1238,7 @@
           <w:sz w:val="18"/>
           <w:szCs w:val="18"/>
         </w:rPr>
-        <w:t xml:space="preserve">[PLACEHOLDER] </w:t>
+        <w:t xml:space="preserve"/>
       </w:r>
       <w:r>
         <w:rPr>
@@ -1248,7 +1248,7 @@
           <w:sz w:val="18"/>
           <w:szCs w:val="18"/>
         </w:rPr>
-        <w:t>Exercises to be added once this session is drafted.</w:t>
+        <w:t>Four exercises. (1) Sign-off vote at the opening and again at the close — Menti, three options, so the two votes can be compared. (2) Sort strong from weak questions — eight candidate questions the room marks S or W, then the reveal explains why; no tech needed. (3) The clinic itself — groups of four interrogate the trainer, who plays the evaluator, using the printed QA checklist. (4) AI question list, then compare it with the room's own — one device per group. The QA checklist handout is built and ready to print: Module_2_Oct_2026_v2/Oct14_session3_qa_checklist.qmd renders to docx with all twenty questions in four areas, and the same source drives the deck.</w:t>
       </w:r>
     </w:p>
     <w:tbl>
@@ -6612,7 +6612,7 @@
           <w:sz w:val="18"/>
           <w:szCs w:val="18"/>
         </w:rPr>
-        <w:t xml:space="preserve">[PLACEHOLDER] </w:t>
+        <w:t xml:space="preserve"/>
       </w:r>
       <w:r>
         <w:rPr>
@@ -6622,7 +6622,7 @@
           <w:sz w:val="18"/>
           <w:szCs w:val="18"/>
         </w:rPr>
-        <w:t>Exercises to be added once this session is drafted.</w:t>
+        <w:t>Four exercises. (1) Sign-off vote at the opening and again at the close — Menti, three options, so the two votes can be compared. (2) Sort strong from weak questions — eight candidate questions the room marks S or W, then the reveal explains why; no tech needed. (3) The clinic itself — groups of four interrogate the trainer, who plays the evaluator, using the printed QA checklist. (4) AI question list, then compare it with the room's own — one device per group. The QA checklist handout is built and ready to print: Module_2_Oct_2026_v2/Oct14_session3_qa_checklist.qmd renders to docx with all twenty questions in four areas, and the same source drives the deck.</w:t>
       </w:r>
     </w:p>
     <w:tbl>
@@ -7168,7 +7168,7 @@
           <w:sz w:val="18"/>
           <w:szCs w:val="18"/>
         </w:rPr>
-        <w:t xml:space="preserve">[PLACEHOLDER] </w:t>
+        <w:t xml:space="preserve"/>
       </w:r>
       <w:r>
         <w:rPr>
@@ -7178,7 +7178,7 @@
           <w:sz w:val="18"/>
           <w:szCs w:val="18"/>
         </w:rPr>
-        <w:t>Exercises to be added once this session is drafted.</w:t>
+        <w:t>Four exercises. (1) Sign-off vote at the opening and again at the close — Menti, three options, so the two votes can be compared. (2) Sort strong from weak questions — eight candidate questions the room marks S or W, then the reveal explains why; no tech needed. (3) The clinic itself — groups of four interrogate the trainer, who plays the evaluator, using the printed QA checklist. (4) AI question list, then compare it with the room's own — one device per group. The QA checklist handout is built and ready to print: Module_2_Oct_2026_v2/Oct14_session3_qa_checklist.qmd renders to docx with all twenty questions in four areas, and the same source drives the deck.</w:t>
       </w:r>
     </w:p>
     <w:tbl>
@@ -7724,7 +7724,7 @@
           <w:sz w:val="18"/>
           <w:szCs w:val="18"/>
         </w:rPr>
-        <w:t xml:space="preserve">[PLACEHOLDER] </w:t>
+        <w:t xml:space="preserve"/>
       </w:r>
       <w:r>
         <w:rPr>
@@ -7734,7 +7734,7 @@
           <w:sz w:val="18"/>
           <w:szCs w:val="18"/>
         </w:rPr>
-        <w:t>Exercises to be added once this session is drafted.</w:t>
+        <w:t>Four exercises. (1) Sign-off vote at the opening and again at the close — Menti, three options, so the two votes can be compared. (2) Sort strong from weak questions — eight candidate questions the room marks S or W, then the reveal explains why; no tech needed. (3) The clinic itself — groups of four interrogate the trainer, who plays the evaluator, using the printed QA checklist. (4) AI question list, then compare it with the room's own — one device per group. The QA checklist handout is built and ready to print: Module_2_Oct_2026_v2/Oct14_session3_qa_checklist.qmd renders to docx with all twenty questions in four areas, and the same source drives the deck.</w:t>
       </w:r>
     </w:p>
     <w:tbl>
@@ -8280,7 +8280,7 @@
           <w:sz w:val="18"/>
           <w:szCs w:val="18"/>
         </w:rPr>
-        <w:t xml:space="preserve">[PLACEHOLDER] </w:t>
+        <w:t xml:space="preserve"/>
       </w:r>
       <w:r>
         <w:rPr>
@@ -8290,7 +8290,7 @@
           <w:sz w:val="18"/>
           <w:szCs w:val="18"/>
         </w:rPr>
-        <w:t>Exercises to be added once this session is drafted.</w:t>
+        <w:t>Four exercises. (1) Sign-off vote at the opening and again at the close — Menti, three options, so the two votes can be compared. (2) Sort strong from weak questions — eight candidate questions the room marks S or W, then the reveal explains why; no tech needed. (3) The clinic itself — groups of four interrogate the trainer, who plays the evaluator, using the printed QA checklist. (4) AI question list, then compare it with the room's own — one device per group. The QA checklist handout is built and ready to print: Module_2_Oct_2026_v2/Oct14_session3_qa_checklist.qmd renders to docx with all twenty questions in four areas, and the same source drives the deck.</w:t>
       </w:r>
     </w:p>
     <w:tbl>
@@ -8836,7 +8836,7 @@
           <w:sz w:val="18"/>
           <w:szCs w:val="18"/>
         </w:rPr>
-        <w:t xml:space="preserve">[PLACEHOLDER] </w:t>
+        <w:t xml:space="preserve"/>
       </w:r>
       <w:r>
         <w:rPr>
@@ -8846,7 +8846,7 @@
           <w:sz w:val="18"/>
           <w:szCs w:val="18"/>
         </w:rPr>
-        <w:t>Exercises to be added once this session is drafted.</w:t>
+        <w:t>Four exercises. (1) Sign-off vote at the opening and again at the close — Menti, three options, so the two votes can be compared. (2) Sort strong from weak questions — eight candidate questions the room marks S or W, then the reveal explains why; no tech needed. (3) The clinic itself — groups of four interrogate the trainer, who plays the evaluator, using the printed QA checklist. (4) AI question list, then compare it with the room's own — one device per group. The QA checklist handout is built and ready to print: Module_2_Oct_2026_v2/Oct14_session3_qa_checklist.qmd renders to docx with all twenty questions in four areas, and the same source drives the deck.</w:t>
       </w:r>
     </w:p>
     <w:tbl>
@@ -9393,7 +9393,7 @@
           <w:sz w:val="18"/>
           <w:szCs w:val="18"/>
         </w:rPr>
-        <w:t xml:space="preserve">[PLACEHOLDER] </w:t>
+        <w:t xml:space="preserve"/>
       </w:r>
       <w:r>
         <w:rPr>
@@ -9403,7 +9403,7 @@
           <w:sz w:val="18"/>
           <w:szCs w:val="18"/>
         </w:rPr>
-        <w:t>Exercises to be added once this session is drafted.</w:t>
+        <w:t>Four exercises. (1) Sign-off vote at the opening and again at the close — Menti, three options, so the two votes can be compared. (2) Sort strong from weak questions — eight candidate questions the room marks S or W, then the reveal explains why; no tech needed. (3) The clinic itself — groups of four interrogate the trainer, who plays the evaluator, using the printed QA checklist. (4) AI question list, then compare it with the room's own — one device per group. The QA checklist handout is built and ready to print: Module_2_Oct_2026_v2/Oct14_session3_qa_checklist.qmd renders to docx with all twenty questions in four areas, and the same source drives the deck.</w:t>
       </w:r>
     </w:p>
     <w:tbl>
@@ -9936,6 +9936,30 @@
     </w:sectPr>
   </w:body>
 </w:document>
+</file>
+
+<file path=word/comments.xml><?xml version="1.0" encoding="utf-8"?>
+<w:comments xmlns:wpc="http://schemas.microsoft.com/office/word/2010/wordprocessingCanvas" xmlns:mo="http://schemas.microsoft.com/office/mac/office/2008/main" xmlns:mc="http://schemas.openxmlformats.org/markup-compatibility/2006" xmlns:mv="urn:schemas-microsoft-com:mac:vml" xmlns:o="urn:schemas-microsoft-com:office:office" xmlns:r="http://schemas.openxmlformats.org/officeDocument/2006/relationships" xmlns:m="http://schemas.openxmlformats.org/officeDocument/2006/math" xmlns:v="urn:schemas-microsoft-com:vml" xmlns:wp14="http://schemas.microsoft.com/office/word/2010/wordprocessingDrawing" xmlns:wp="http://schemas.openxmlformats.org/drawingml/2006/wordprocessingDrawing" xmlns:w10="urn:schemas-microsoft-com:office:word" xmlns:w="http://schemas.openxmlformats.org/wordprocessingml/2006/main" xmlns:w14="http://schemas.microsoft.com/office/word/2010/wordml" xmlns:wpg="http://schemas.microsoft.com/office/word/2010/wordprocessingGroup" xmlns:wpi="http://schemas.microsoft.com/office/word/2010/wordprocessingInk" xmlns:wne="http://schemas.microsoft.com/office/word/2006/wordml" xmlns:wps="http://schemas.microsoft.com/office/word/2010/wordprocessingShape" mc:Ignorable="w14 wp14">
+</w:comments>
+</file>
+
+<file path=word/footnotes.xml><?xml version="1.0" encoding="utf-8"?>
+<w:footnotes xmlns:wpc="http://schemas.microsoft.com/office/word/2010/wordprocessingCanvas" xmlns:mo="http://schemas.microsoft.com/office/mac/office/2008/main" xmlns:mc="http://schemas.openxmlformats.org/markup-compatibility/2006" xmlns:mv="urn:schemas-microsoft-com:mac:vml" xmlns:o="urn:schemas-microsoft-com:office:office" xmlns:r="http://schemas.openxmlformats.org/officeDocument/2006/relationships" xmlns:m="http://schemas.openxmlformats.org/officeDocument/2006/math" xmlns:v="urn:schemas-microsoft-com:vml" xmlns:wp14="http://schemas.microsoft.com/office/word/2010/wordprocessingDrawing" xmlns:wp="http://schemas.openxmlformats.org/drawingml/2006/wordprocessingDrawing" xmlns:w10="urn:schemas-microsoft-com:office:word" xmlns:w="http://schemas.openxmlformats.org/wordprocessingml/2006/main" xmlns:w14="http://schemas.microsoft.com/office/word/2010/wordml" xmlns:wpg="http://schemas.microsoft.com/office/word/2010/wordprocessingGroup" xmlns:wpi="http://schemas.microsoft.com/office/word/2010/wordprocessingInk" xmlns:wne="http://schemas.microsoft.com/office/word/2006/wordml" xmlns:wps="http://schemas.microsoft.com/office/word/2010/wordprocessingShape" mc:Ignorable="w14 wp14">
+  <w:footnote w:type="separator" w:id="-1">
+    <w:p>
+      <w:r>
+        <w:separator/>
+      </w:r>
+    </w:p>
+  </w:footnote>
+  <w:footnote w:type="continuationSeparator" w:id="0">
+    <w:p>
+      <w:r>
+        <w:continuationSeparator/>
+      </w:r>
+    </w:p>
+  </w:footnote>
+</w:footnotes>
 </file>
 
 <file path=word/numbering.xml><?xml version="1.0" encoding="utf-8"?>

</xml_diff>

<commit_message>
Added more interactive code and edited tone to de-AI text across all sessions
Added interactive code especially to day 1 session 2, simplifying it and moving through descriptive stats slowly. Edited AI activities to be more realistic and changed text to make it sound less like AI throughout all sessions
</commit_message>
<xml_diff>
--- a/Module_2_Oct_2026_v2/Module2_exercise_plan.docx
+++ b/Module_2_Oct_2026_v2/Module2_exercise_plan.docx
@@ -552,7 +552,7 @@
           <w:i/>
           <w:iCs/>
         </w:rPr>
-        <w:t>Now drafted. Runs on a fictional automated-speed-camera dataset (the case names no real body); every figure carries an illustrative-data disclaimer.</w:t>
+        <w:t>Revised 24 Sep. Runs on a fictional automated-speed-camera dataset (the case names no real body); every figure carries an illustrative-data disclaimer. The session is now descriptive and run live: the trainer runs R in the browser (webR, needs internet) to open the data, graph it and measure the before-and-after change in camera sectors, using the Session 1 vocabulary. It ends on “compared to what?” and hands over to Session 3. The case is not reused in later sessions. The old AI Snapshot (“three sentences for a decision-maker” on a DiD table) is replaced by the chart exercise below, and the annotate handout now uses the before-and-after regression output.</w:t>
       </w:r>
     </w:p>
     <w:tbl>
@@ -676,7 +676,7 @@
               <w:pStyle w:val="Compact"/>
             </w:pPr>
             <w:r>
-              <w:t>~0:20 · Section 2, “Would you fund the extension?”</w:t>
+              <w:t>~0:32 · Section 3, “Would you fund the extension?”; results revisited ~1:18 in Section 6, “Look back at your vote”</w:t>
             </w:r>
           </w:p>
         </w:tc>
@@ -702,37 +702,33 @@
               <w:pStyle w:val="Compact"/>
             </w:pPr>
             <w:r>
-              <w:t>The Menti poll; QR is in the deck</w:t>
-            </w:r>
-          </w:p>
-        </w:tc>
-        <w:tc>
-          <w:tcPr>
-            <w:tcW w:w="0" w:type="auto"/>
-          </w:tcPr>
-          <w:p>
-            <w:pPr>
-              <w:pStyle w:val="Compact"/>
-            </w:pPr>
-            <w:r>
-              <w:t xml:space="preserve">Single MC on the headline (−22% before-and-after): “Would you commit the money?” Options: Yes / No / Not on this alone. Same poll shape as Session 1: the room commits before seeing the comparison group. PwC: </w:t>
-            </w:r>
-            <w:r>
-              <w:lastRenderedPageBreak/>
-              <w:t>create the poll in Menti.</w:t>
-            </w:r>
-          </w:p>
-        </w:tc>
-        <w:tc>
-          <w:tcPr>
-            <w:tcW w:w="0" w:type="auto"/>
-          </w:tcPr>
-          <w:p>
-            <w:pPr>
-              <w:pStyle w:val="Compact"/>
-            </w:pPr>
-            <w:r>
-              <w:lastRenderedPageBreak/>
+              <w:t>The Menti poll; QR and results embed are in the deck (set MENTI_CODE and MENTI_EMBED)</w:t>
+            </w:r>
+          </w:p>
+        </w:tc>
+        <w:tc>
+          <w:tcPr>
+            <w:tcW w:w="0" w:type="auto"/>
+          </w:tcPr>
+          <w:p>
+            <w:pPr>
+              <w:pStyle w:val="Compact"/>
+            </w:pPr>
+            <w:r>
+              <w:t>Single MC on the before-and-after chart for camera sectors only (11.5 to 9.0 injury collisions per segment): “Would you commit the money to extend them?” Options: Yes / No / Not on this alone. Results are shown again after the room sees that roads without cameras also improved.</w:t>
+            </w:r>
+            <w:r/>
+          </w:p>
+        </w:tc>
+        <w:tc>
+          <w:tcPr>
+            <w:tcW w:w="0" w:type="auto"/>
+          </w:tcPr>
+          <w:p>
+            <w:pPr>
+              <w:pStyle w:val="Compact"/>
+            </w:pPr>
+            <w:r>
               <w:t>Menti poll to build</w:t>
             </w:r>
           </w:p>
@@ -748,78 +744,316 @@
               <w:pStyle w:val="Compact"/>
             </w:pPr>
             <w:r>
-              <w:t>AI Snapshot — mark up “three sentences for a decision-maker”</w:t>
-            </w:r>
-          </w:p>
-        </w:tc>
-        <w:tc>
-          <w:tcPr>
-            <w:tcW w:w="0" w:type="auto"/>
-          </w:tcPr>
-          <w:p>
-            <w:pPr>
-              <w:pStyle w:val="Compact"/>
-            </w:pPr>
-            <w:r>
-              <w:t>~0:38 · Section 4, “AI Snapshot”</w:t>
-            </w:r>
-          </w:p>
-        </w:tc>
-        <w:tc>
-          <w:tcPr>
-            <w:tcW w:w="0" w:type="auto"/>
-          </w:tcPr>
-          <w:p>
-            <w:pPr>
-              <w:pStyle w:val="Compact"/>
-            </w:pPr>
-            <w:r>
-              <w:t>Small-group hands-on + AI (mark-up demo)</w:t>
-            </w:r>
-          </w:p>
-        </w:tc>
-        <w:tc>
-          <w:tcPr>
-            <w:tcW w:w="0" w:type="auto"/>
-          </w:tcPr>
-          <w:p>
-            <w:pPr>
-              <w:pStyle w:val="Compact"/>
-            </w:pPr>
-            <w:r>
-              <w:t>Printed copy of the flawed AI answer, one per group; a device with AI access per group; a printed copy of the results table</w:t>
-            </w:r>
-          </w:p>
-        </w:tc>
-        <w:tc>
-          <w:tcPr>
-            <w:tcW w:w="0" w:type="auto"/>
-          </w:tcPr>
-          <w:p>
-            <w:pPr>
-              <w:pStyle w:val="Compact"/>
-            </w:pPr>
-            <w:r>
-              <w:t>Groups paste the results table with the prompt “Explain this result to a decision-maker in three sentences. They have a rule: avoid 2.0 collisions per segment per round to be funded”</w:t>
-            </w:r>
-            <w:r>
-              <w:t xml:space="preserve">, then mark up the response. Three planted problems: the 22% is real but not the impact (the true estimate is 1.13), “likely to be even larger” </w:t>
-            </w:r>
-            <w:r>
-              <w:t>is invented, and the flagged closing sentence recommends national funding the table does not support. PwC: print the flawed answer with room to annotate, plus a facilitator key naming the three errors, and the results table. Swap in Fiona’s real capture when available. This session’s AI Snapshot is the shorter demo-plus-debrief form, not the full bad-prompt/good-prompt group exercise.</w:t>
-            </w:r>
-          </w:p>
-        </w:tc>
-        <w:tc>
-          <w:tcPr>
-            <w:tcW w:w="0" w:type="auto"/>
-          </w:tcPr>
-          <w:p>
-            <w:pPr>
-              <w:pStyle w:val="Compact"/>
-            </w:pPr>
-            <w:r>
-              <w:t>Handout to build (real capture to be swapped in)</w:t>
+              <w:t>Call the number — live-code predictions</w:t>
+            </w:r>
+          </w:p>
+        </w:tc>
+        <w:tc>
+          <w:tcPr>
+            <w:tcW w:w="0" w:type="auto"/>
+          </w:tcPr>
+          <w:p>
+            <w:pPr>
+              <w:pStyle w:val="Compact"/>
+            </w:pPr>
+            <w:r>
+              <w:t>Throughout Sections 2–4 (e.g. “How many road segments?”, “Which number is the change?”)</w:t>
+            </w:r>
+          </w:p>
+        </w:tc>
+        <w:tc>
+          <w:tcPr>
+            <w:tcW w:w="0" w:type="auto"/>
+          </w:tcPr>
+          <w:p>
+            <w:pPr>
+              <w:pStyle w:val="Compact"/>
+            </w:pPr>
+            <w:r>
+              <w:t>Whole-room verbal prediction before the trainer presses Run</w:t>
+            </w:r>
+          </w:p>
+        </w:tc>
+        <w:tc>
+          <w:tcPr>
+            <w:tcW w:w="0" w:type="auto"/>
+          </w:tcPr>
+          <w:p>
+            <w:pPr>
+              <w:pStyle w:val="Compact"/>
+            </w:pPr>
+            <w:r>
+              <w:t>None</w:t>
+            </w:r>
+          </w:p>
+        </w:tc>
+        <w:tc>
+          <w:tcPr>
+            <w:tcW w:w="0" w:type="auto"/>
+          </w:tcPr>
+          <w:p>
+            <w:pPr>
+              <w:pStyle w:val="Compact"/>
+            </w:pPr>
+            <w:r>
+              <w:t>No build. Participants say a number or pick a row before each live result appears.</w:t>
+            </w:r>
+            <w:r/>
+          </w:p>
+        </w:tc>
+        <w:tc>
+          <w:tcPr>
+            <w:tcW w:w="0" w:type="auto"/>
+          </w:tcPr>
+          <w:p>
+            <w:pPr>
+              <w:pStyle w:val="Compact"/>
+            </w:pPr>
+            <w:r>
+              <w:t>In slides</w:t>
+            </w:r>
+          </w:p>
+        </w:tc>
+      </w:tr>
+      <w:tr>
+        <w:tc>
+          <w:tcPr>
+            <w:tcW w:w="0" w:type="auto"/>
+          </w:tcPr>
+          <w:p>
+            <w:pPr>
+              <w:pStyle w:val="Compact"/>
+            </w:pPr>
+            <w:r>
+              <w:t>AI Snapshot — ask AI to read the chart</w:t>
+            </w:r>
+          </w:p>
+        </w:tc>
+        <w:tc>
+          <w:tcPr>
+            <w:tcW w:w="0" w:type="auto"/>
+          </w:tcPr>
+          <w:p>
+            <w:pPr>
+              <w:pStyle w:val="Compact"/>
+            </w:pPr>
+            <w:r>
+              <w:t>~0:55–1:10 · Section 5, “AI Snapshot”, “Debrief”, “A better prompt”</w:t>
+            </w:r>
+          </w:p>
+        </w:tc>
+        <w:tc>
+          <w:tcPr>
+            <w:tcW w:w="0" w:type="auto"/>
+          </w:tcPr>
+          <w:p>
+            <w:pPr>
+              <w:pStyle w:val="Compact"/>
+            </w:pPr>
+            <w:r>
+              <w:t>Pair hands-on + AI (mark-up, then bad vs good prompt)</w:t>
+            </w:r>
+          </w:p>
+        </w:tc>
+        <w:tc>
+          <w:tcPr>
+            <w:tcW w:w="0" w:type="auto"/>
+          </w:tcPr>
+          <w:p>
+            <w:pPr>
+              <w:pStyle w:val="Compact"/>
+            </w:pPr>
+            <w:r>
+              <w:t>Printed before-and-after bar chart with the flawed AI answer beneath it, one per pair; two prompt cards; one device with AI access per pair</w:t>
+            </w:r>
+          </w:p>
+        </w:tc>
+        <w:tc>
+          <w:tcPr>
+            <w:tcW w:w="0" w:type="auto"/>
+          </w:tcPr>
+          <w:p>
+            <w:pPr>
+              <w:pStyle w:val="Compact"/>
+            </w:pPr>
+            <w:r>
+              <w:t>(1) Pairs mark up the illustrative AI answer to “What does this chart show? Did the cameras work?”. Planted errors: an invented p-value, a causal claim from a before-and-after chart, an invented “consistent across all road types”, and a recommendation with no rule or comparison. (2) Pairs run the short prompt and the better prompt (on the “A better prompt” slide) on a photo of the chart and compare. Card text is on the slides. Swap in a real captured AI answer if Fiona gets one.</w:t>
+            </w:r>
+            <w:r/>
+          </w:p>
+        </w:tc>
+        <w:tc>
+          <w:tcPr>
+            <w:tcW w:w="0" w:type="auto"/>
+          </w:tcPr>
+          <w:p>
+            <w:pPr>
+              <w:pStyle w:val="Compact"/>
+            </w:pPr>
+            <w:r>
+              <w:t>Handout + cards to build</w:t>
+            </w:r>
+          </w:p>
+        </w:tc>
+      </w:tr>
+      <w:tr>
+        <w:tc>
+          <w:tcPr>
+            <w:tcW w:w="0" w:type="auto"/>
+          </w:tcPr>
+          <w:p>
+            <w:pPr>
+              <w:pStyle w:val="Compact"/>
+            </w:pPr>
+            <w:r>
+              <w:t>“Compared to what?” table discussion</w:t>
+            </w:r>
+          </w:p>
+        </w:tc>
+        <w:tc>
+          <w:tcPr>
+            <w:tcW w:w="0" w:type="auto"/>
+          </w:tcPr>
+          <w:p>
+            <w:pPr>
+              <w:pStyle w:val="Compact"/>
+            </w:pPr>
+            <w:r>
+              <w:t>~1:10 · Section 6, “What else happened between 2019 and 2021?”</w:t>
+            </w:r>
+          </w:p>
+        </w:tc>
+        <w:tc>
+          <w:tcPr>
+            <w:tcW w:w="0" w:type="auto"/>
+          </w:tcPr>
+          <w:p>
+            <w:pPr>
+              <w:pStyle w:val="Compact"/>
+            </w:pPr>
+            <w:r>
+              <w:t>Table discussion (no tech)</w:t>
+            </w:r>
+          </w:p>
+        </w:tc>
+        <w:tc>
+          <w:tcPr>
+            <w:tcW w:w="0" w:type="auto"/>
+          </w:tcPr>
+          <w:p>
+            <w:pPr>
+              <w:pStyle w:val="Compact"/>
+            </w:pPr>
+            <w:r>
+              <w:t>None (optional flipchart)</w:t>
+            </w:r>
+          </w:p>
+        </w:tc>
+        <w:tc>
+          <w:tcPr>
+            <w:tcW w:w="0" w:type="auto"/>
+          </w:tcPr>
+          <w:p>
+            <w:pPr>
+              <w:pStyle w:val="Compact"/>
+            </w:pPr>
+            <w:r>
+              <w:t>Tables list two or three things apart from cameras that could have cut collisions, and what they would compare the camera roads with. No build.</w:t>
+            </w:r>
+            <w:r/>
+          </w:p>
+        </w:tc>
+        <w:tc>
+          <w:tcPr>
+            <w:tcW w:w="0" w:type="auto"/>
+          </w:tcPr>
+          <w:p>
+            <w:pPr>
+              <w:pStyle w:val="Compact"/>
+            </w:pPr>
+            <w:r>
+              <w:t>In slides</w:t>
+            </w:r>
+          </w:p>
+        </w:tc>
+      </w:tr>
+      <w:tr>
+        <w:tc>
+          <w:tcPr>
+            <w:tcW w:w="0" w:type="auto"/>
+          </w:tcPr>
+          <w:p>
+            <w:pPr>
+              <w:pStyle w:val="Compact"/>
+            </w:pPr>
+            <w:r>
+              <w:t>Annotate this output</w:t>
+            </w:r>
+          </w:p>
+        </w:tc>
+        <w:tc>
+          <w:tcPr>
+            <w:tcW w:w="0" w:type="auto"/>
+          </w:tcPr>
+          <w:p>
+            <w:pPr>
+              <w:pStyle w:val="Compact"/>
+            </w:pPr>
+            <w:r>
+              <w:t>~1:20 · Section 7, “Annotate this output”</w:t>
+            </w:r>
+          </w:p>
+        </w:tc>
+        <w:tc>
+          <w:tcPr>
+            <w:tcW w:w="0" w:type="auto"/>
+          </w:tcPr>
+          <w:p>
+            <w:pPr>
+              <w:pStyle w:val="Compact"/>
+            </w:pPr>
+            <w:r>
+              <w:t>Individual hands-on (printed handout)</w:t>
+            </w:r>
+          </w:p>
+        </w:tc>
+        <w:tc>
+          <w:tcPr>
+            <w:tcW w:w="0" w:type="auto"/>
+          </w:tcPr>
+          <w:p>
+            <w:pPr>
+              <w:pStyle w:val="Compact"/>
+            </w:pPr>
+            <w:r>
+              <w:t>Printed regression output, one per participant</w:t>
+            </w:r>
+          </w:p>
+        </w:tc>
+        <w:tc>
+          <w:tcPr>
+            <w:tcW w:w="0" w:type="auto"/>
+          </w:tcPr>
+          <w:p>
+            <w:pPr>
+              <w:pStyle w:val="Compact"/>
+            </w:pPr>
+            <w:r>
+              <w:t>One-page handout with the before-and-after regression table (camera sectors only; rows (Intercept) and round; columns Estimate, Std. Error, p-value, CI Lower, CI Upper; values on the slide) and four tasks: circle the change, box its confidence interval, underline the 2019 average and say why it is not an effect, write the comparison you would ask the evaluator for.</w:t>
+            </w:r>
+            <w:r/>
+          </w:p>
+        </w:tc>
+        <w:tc>
+          <w:tcPr>
+            <w:tcW w:w="0" w:type="auto"/>
+          </w:tcPr>
+          <w:p>
+            <w:pPr>
+              <w:pStyle w:val="Compact"/>
+            </w:pPr>
+            <w:r>
+              <w:t>Handout to build</w:t>
             </w:r>
           </w:p>
         </w:tc>
@@ -1454,6 +1688,86 @@
               <w:pStyle w:val="Compact"/>
             </w:pPr>
             <w:r>
+              <w:t>Ask AI first: questions for the evaluator (OPTIONAL)</w:t>
+            </w:r>
+          </w:p>
+        </w:tc>
+        <w:tc>
+          <w:tcPr>
+            <w:tcW w:w="0" w:type="auto"/>
+          </w:tcPr>
+          <w:p>
+            <w:pPr>
+              <w:pStyle w:val="Compact"/>
+            </w:pPr>
+            <w:r>
+              <w:t>~1:03 · Section 7, “Your turn: ask AI first”, just before the questions slide</w:t>
+            </w:r>
+          </w:p>
+        </w:tc>
+        <w:tc>
+          <w:tcPr>
+            <w:tcW w:w="0" w:type="auto"/>
+          </w:tcPr>
+          <w:p>
+            <w:pPr>
+              <w:pStyle w:val="Compact"/>
+            </w:pPr>
+            <w:r>
+              <w:t>Pair/individual hands-on + AI</w:t>
+            </w:r>
+          </w:p>
+        </w:tc>
+        <w:tc>
+          <w:tcPr>
+            <w:tcW w:w="0" w:type="auto"/>
+          </w:tcPr>
+          <w:p>
+            <w:pPr>
+              <w:pStyle w:val="Compact"/>
+            </w:pPr>
+            <w:r>
+              <w:t>A device with AI access per pair; none printed</w:t>
+            </w:r>
+          </w:p>
+        </w:tc>
+        <w:tc>
+          <w:tcPr>
+            <w:tcW w:w="0" w:type="auto"/>
+          </w:tcPr>
+          <w:p>
+            <w:pPr>
+              <w:pStyle w:val="Compact"/>
+            </w:pPr>
+            <w:r>
+              <w:t>Participants ask an AI: “I am a commissioner about to hear an evaluator present a randomised controlled trial (RCT) result. What are the key questions I should ask? Fit them on one slide.” Three minutes, then the trainer reveals the session’s question list and the room compares: what did the AI miss, add, or get wrong? Optional: if time is short the trainer skips straight to the list.</w:t>
+            </w:r>
+          </w:p>
+        </w:tc>
+        <w:tc>
+          <w:tcPr>
+            <w:tcW w:w="0" w:type="auto"/>
+          </w:tcPr>
+          <w:p>
+            <w:pPr>
+              <w:pStyle w:val="Compact"/>
+            </w:pPr>
+            <w:r>
+              <w:t>In slides (no build)</w:t>
+            </w:r>
+          </w:p>
+        </w:tc>
+      </w:tr>
+      <w:tr>
+        <w:tc>
+          <w:tcPr>
+            <w:tcW w:w="0" w:type="auto"/>
+          </w:tcPr>
+          <w:p>
+            <w:pPr>
+              <w:pStyle w:val="Compact"/>
+            </w:pPr>
+            <w:r>
               <w:t>Closing “three questions” take-away card</w:t>
             </w:r>
           </w:p>
@@ -2131,6 +2445,86 @@
           </w:p>
         </w:tc>
       </w:tr>
+      <w:tr>
+        <w:tc>
+          <w:tcPr>
+            <w:tcW w:w="0" w:type="auto"/>
+          </w:tcPr>
+          <w:p>
+            <w:pPr>
+              <w:pStyle w:val="Compact"/>
+            </w:pPr>
+            <w:r>
+              <w:t>Ask AI first: questions for the evaluator (OPTIONAL)</w:t>
+            </w:r>
+          </w:p>
+        </w:tc>
+        <w:tc>
+          <w:tcPr>
+            <w:tcW w:w="0" w:type="auto"/>
+          </w:tcPr>
+          <w:p>
+            <w:pPr>
+              <w:pStyle w:val="Compact"/>
+            </w:pPr>
+            <w:r>
+              <w:t>~1:25 · Close, “Your turn: ask AI first”, just before the questions slide</w:t>
+            </w:r>
+          </w:p>
+        </w:tc>
+        <w:tc>
+          <w:tcPr>
+            <w:tcW w:w="0" w:type="auto"/>
+          </w:tcPr>
+          <w:p>
+            <w:pPr>
+              <w:pStyle w:val="Compact"/>
+            </w:pPr>
+            <w:r>
+              <w:t>Pair/individual hands-on + AI</w:t>
+            </w:r>
+          </w:p>
+        </w:tc>
+        <w:tc>
+          <w:tcPr>
+            <w:tcW w:w="0" w:type="auto"/>
+          </w:tcPr>
+          <w:p>
+            <w:pPr>
+              <w:pStyle w:val="Compact"/>
+            </w:pPr>
+            <w:r>
+              <w:t>A device with AI access per pair; none printed</w:t>
+            </w:r>
+          </w:p>
+        </w:tc>
+        <w:tc>
+          <w:tcPr>
+            <w:tcW w:w="0" w:type="auto"/>
+          </w:tcPr>
+          <w:p>
+            <w:pPr>
+              <w:pStyle w:val="Compact"/>
+            </w:pPr>
+            <w:r>
+              <w:t>Participants ask an AI: “I am a commissioner about to hear an evaluator present a DiD result. What are the key questions I should ask? Fit them on one slide.” Three minutes, then the trainer reveals the session’s own question list and the room compares: what did the AI miss, add, or get wrong? Optional: if time is short the trainer skips straight to the list.</w:t>
+            </w:r>
+          </w:p>
+        </w:tc>
+        <w:tc>
+          <w:tcPr>
+            <w:tcW w:w="0" w:type="auto"/>
+          </w:tcPr>
+          <w:p>
+            <w:pPr>
+              <w:pStyle w:val="Compact"/>
+            </w:pPr>
+            <w:r>
+              <w:t>In slides (no build)</w:t>
+            </w:r>
+          </w:p>
+        </w:tc>
+      </w:tr>
     </w:tbl>
     <w:p>
       <w:r>
@@ -2773,6 +3167,86 @@
             <w:r>
               <w:lastRenderedPageBreak/>
               <w:t>final</w:t>
+            </w:r>
+          </w:p>
+        </w:tc>
+      </w:tr>
+      <w:tr>
+        <w:tc>
+          <w:tcPr>
+            <w:tcW w:w="0" w:type="auto"/>
+          </w:tcPr>
+          <w:p>
+            <w:pPr>
+              <w:pStyle w:val="Compact"/>
+            </w:pPr>
+            <w:r>
+              <w:t>Ask AI first: questions for the evaluator (OPTIONAL)</w:t>
+            </w:r>
+          </w:p>
+        </w:tc>
+        <w:tc>
+          <w:tcPr>
+            <w:tcW w:w="0" w:type="auto"/>
+          </w:tcPr>
+          <w:p>
+            <w:pPr>
+              <w:pStyle w:val="Compact"/>
+            </w:pPr>
+            <w:r>
+              <w:t>~1:25 · Close, “Your turn: ask AI first”, just before the questions slide</w:t>
+            </w:r>
+          </w:p>
+        </w:tc>
+        <w:tc>
+          <w:tcPr>
+            <w:tcW w:w="0" w:type="auto"/>
+          </w:tcPr>
+          <w:p>
+            <w:pPr>
+              <w:pStyle w:val="Compact"/>
+            </w:pPr>
+            <w:r>
+              <w:t>Pair/individual hands-on + AI</w:t>
+            </w:r>
+          </w:p>
+        </w:tc>
+        <w:tc>
+          <w:tcPr>
+            <w:tcW w:w="0" w:type="auto"/>
+          </w:tcPr>
+          <w:p>
+            <w:pPr>
+              <w:pStyle w:val="Compact"/>
+            </w:pPr>
+            <w:r>
+              <w:t>A device with AI access per pair; none printed</w:t>
+            </w:r>
+          </w:p>
+        </w:tc>
+        <w:tc>
+          <w:tcPr>
+            <w:tcW w:w="0" w:type="auto"/>
+          </w:tcPr>
+          <w:p>
+            <w:pPr>
+              <w:pStyle w:val="Compact"/>
+            </w:pPr>
+            <w:r>
+              <w:t>Participants ask an AI: “I am a commissioner about to hear an evaluator present a RDD result. What are the key questions I should ask? Fit them on one slide.” Three minutes, then the trainer reveals the session’s own question list and the room compares: what did the AI miss, add, or get wrong? Optional: if time is short the trainer skips straight to the list.</w:t>
+            </w:r>
+          </w:p>
+        </w:tc>
+        <w:tc>
+          <w:tcPr>
+            <w:tcW w:w="0" w:type="auto"/>
+          </w:tcPr>
+          <w:p>
+            <w:pPr>
+              <w:pStyle w:val="Compact"/>
+            </w:pPr>
+            <w:r>
+              <w:t>In slides (no build)</w:t>
             </w:r>
           </w:p>
         </w:tc>
@@ -3298,6 +3772,86 @@
             </w:pPr>
             <w:r>
               <w:t>Handout (optional)</w:t>
+            </w:r>
+          </w:p>
+        </w:tc>
+      </w:tr>
+      <w:tr>
+        <w:tc>
+          <w:tcPr>
+            <w:tcW w:w="0" w:type="auto"/>
+          </w:tcPr>
+          <w:p>
+            <w:pPr>
+              <w:pStyle w:val="Compact"/>
+            </w:pPr>
+            <w:r>
+              <w:t>Ask AI first: questions for the evaluator (OPTIONAL)</w:t>
+            </w:r>
+          </w:p>
+        </w:tc>
+        <w:tc>
+          <w:tcPr>
+            <w:tcW w:w="0" w:type="auto"/>
+          </w:tcPr>
+          <w:p>
+            <w:pPr>
+              <w:pStyle w:val="Compact"/>
+            </w:pPr>
+            <w:r>
+              <w:t>~1:50 · Close, “Your turn: ask AI first”, just before the questions slide</w:t>
+            </w:r>
+          </w:p>
+        </w:tc>
+        <w:tc>
+          <w:tcPr>
+            <w:tcW w:w="0" w:type="auto"/>
+          </w:tcPr>
+          <w:p>
+            <w:pPr>
+              <w:pStyle w:val="Compact"/>
+            </w:pPr>
+            <w:r>
+              <w:t>Pair/individual hands-on + AI</w:t>
+            </w:r>
+          </w:p>
+        </w:tc>
+        <w:tc>
+          <w:tcPr>
+            <w:tcW w:w="0" w:type="auto"/>
+          </w:tcPr>
+          <w:p>
+            <w:pPr>
+              <w:pStyle w:val="Compact"/>
+            </w:pPr>
+            <w:r>
+              <w:t>A device with AI access per pair; none printed</w:t>
+            </w:r>
+          </w:p>
+        </w:tc>
+        <w:tc>
+          <w:tcPr>
+            <w:tcW w:w="0" w:type="auto"/>
+          </w:tcPr>
+          <w:p>
+            <w:pPr>
+              <w:pStyle w:val="Compact"/>
+            </w:pPr>
+            <w:r>
+              <w:t>Participants ask an AI: “I am a commissioner about to hear an evaluator present a matching result. What are the key questions I should ask? Fit them on one slide.” Three minutes, then the trainer reveals the session’s own question list and the room compares: what did the AI miss, add, or get wrong? Optional: if time is short the trainer skips straight to the list.</w:t>
+            </w:r>
+          </w:p>
+        </w:tc>
+        <w:tc>
+          <w:tcPr>
+            <w:tcW w:w="0" w:type="auto"/>
+          </w:tcPr>
+          <w:p>
+            <w:pPr>
+              <w:pStyle w:val="Compact"/>
+            </w:pPr>
+            <w:r>
+              <w:t>In slides (no build)</w:t>
             </w:r>
           </w:p>
         </w:tc>

</xml_diff>